<commit_message>
docs: fix TOC alignment, layout spacing and font style in final report
</commit_message>
<xml_diff>
--- a/final_report/Automated_PHI_PII_Redaction_Pipeline_LLMs_Internship_Report_24DCS076.docx
+++ b/final_report/Automated_PHI_PII_Redaction_Pipeline_LLMs_Internship_Report_24DCS076.docx
@@ -572,15 +572,15 @@
     <w:p>
       <w:pPr>
         <w:spacing w:line="360" w:lineRule="auto" w:after="80"/>
-        <w:jc w:val="both"/>
+        <w:jc w:val="left"/>
       </w:pPr>
       <w:r>
         <w:rPr>
-          <w:rFonts w:ascii="Courier New" w:hAnsi="Courier New"/>
+          <w:rFonts w:ascii="Times New Roman" w:hAnsi="Times New Roman"/>
           <w:b w:val="0"/>
           <w:i w:val="0"/>
           <w:color w:val="000000"/>
-          <w:sz w:val="19"/>
+          <w:sz w:val="22"/>
         </w:rPr>
         <w:t>Abstract ......................................................................................................................... iii</w:t>
       </w:r>
@@ -588,15 +588,15 @@
     <w:p>
       <w:pPr>
         <w:spacing w:line="360" w:lineRule="auto" w:after="80"/>
-        <w:jc w:val="both"/>
+        <w:jc w:val="left"/>
       </w:pPr>
       <w:r>
         <w:rPr>
-          <w:rFonts w:ascii="Courier New" w:hAnsi="Courier New"/>
+          <w:rFonts w:ascii="Times New Roman" w:hAnsi="Times New Roman"/>
           <w:b w:val="0"/>
           <w:i w:val="0"/>
           <w:color w:val="000000"/>
-          <w:sz w:val="19"/>
+          <w:sz w:val="22"/>
         </w:rPr>
         <w:t>Acknowledgement ........................................................................................................................ iv</w:t>
       </w:r>
@@ -604,15 +604,15 @@
     <w:p>
       <w:pPr>
         <w:spacing w:line="360" w:lineRule="auto" w:after="80"/>
-        <w:jc w:val="both"/>
+        <w:jc w:val="left"/>
       </w:pPr>
       <w:r>
         <w:rPr>
-          <w:rFonts w:ascii="Courier New" w:hAnsi="Courier New"/>
+          <w:rFonts w:ascii="Times New Roman" w:hAnsi="Times New Roman"/>
           <w:b w:val="0"/>
           <w:i w:val="0"/>
           <w:color w:val="000000"/>
-          <w:sz w:val="19"/>
+          <w:sz w:val="22"/>
         </w:rPr>
         <w:t>Description of Company / Organization ........................................................................................... ix</w:t>
       </w:r>
@@ -620,15 +620,15 @@
     <w:p>
       <w:pPr>
         <w:spacing w:line="360" w:lineRule="auto" w:after="80"/>
-        <w:jc w:val="both"/>
+        <w:jc w:val="left"/>
       </w:pPr>
       <w:r>
         <w:rPr>
-          <w:rFonts w:ascii="Courier New" w:hAnsi="Courier New"/>
+          <w:rFonts w:ascii="Times New Roman" w:hAnsi="Times New Roman"/>
           <w:b w:val="0"/>
           <w:i w:val="0"/>
           <w:color w:val="000000"/>
-          <w:sz w:val="19"/>
+          <w:sz w:val="22"/>
         </w:rPr>
         <w:t>CHAPTER 1 — INTRODUCTION ..................................................................................................... 1</w:t>
       </w:r>
@@ -636,15 +636,15 @@
     <w:p>
       <w:pPr>
         <w:spacing w:line="360" w:lineRule="auto" w:after="80"/>
-        <w:jc w:val="both"/>
+        <w:jc w:val="left"/>
       </w:pPr>
       <w:r>
         <w:rPr>
-          <w:rFonts w:ascii="Courier New" w:hAnsi="Courier New"/>
+          <w:rFonts w:ascii="Times New Roman" w:hAnsi="Times New Roman"/>
           <w:b w:val="0"/>
           <w:i w:val="0"/>
           <w:color w:val="000000"/>
-          <w:sz w:val="19"/>
+          <w:sz w:val="22"/>
         </w:rPr>
         <w:t xml:space="preserve">  1.1   BACKGROUND .................................................................................................................. 1</w:t>
       </w:r>
@@ -652,15 +652,15 @@
     <w:p>
       <w:pPr>
         <w:spacing w:line="360" w:lineRule="auto" w:after="80"/>
-        <w:jc w:val="both"/>
+        <w:jc w:val="left"/>
       </w:pPr>
       <w:r>
         <w:rPr>
-          <w:rFonts w:ascii="Courier New" w:hAnsi="Courier New"/>
+          <w:rFonts w:ascii="Times New Roman" w:hAnsi="Times New Roman"/>
           <w:b w:val="0"/>
           <w:i w:val="0"/>
           <w:color w:val="000000"/>
-          <w:sz w:val="19"/>
+          <w:sz w:val="22"/>
         </w:rPr>
         <w:t xml:space="preserve">  1.2   DATA PRIVACY IN HEALTHCARE ........................................................................................ 1</w:t>
       </w:r>
@@ -668,15 +668,15 @@
     <w:p>
       <w:pPr>
         <w:spacing w:line="360" w:lineRule="auto" w:after="80"/>
-        <w:jc w:val="both"/>
+        <w:jc w:val="left"/>
       </w:pPr>
       <w:r>
         <w:rPr>
-          <w:rFonts w:ascii="Courier New" w:hAnsi="Courier New"/>
+          <w:rFonts w:ascii="Times New Roman" w:hAnsi="Times New Roman"/>
           <w:b w:val="0"/>
           <w:i w:val="0"/>
           <w:color w:val="000000"/>
-          <w:sz w:val="19"/>
+          <w:sz w:val="22"/>
         </w:rPr>
         <w:t xml:space="preserve">  1.3   PERSONALLY IDENTIFIABLE INFORMATION (PII) ............................................................. 1</w:t>
       </w:r>
@@ -684,15 +684,15 @@
     <w:p>
       <w:pPr>
         <w:spacing w:line="360" w:lineRule="auto" w:after="80"/>
-        <w:jc w:val="both"/>
+        <w:jc w:val="left"/>
       </w:pPr>
       <w:r>
         <w:rPr>
-          <w:rFonts w:ascii="Courier New" w:hAnsi="Courier New"/>
+          <w:rFonts w:ascii="Times New Roman" w:hAnsi="Times New Roman"/>
           <w:b w:val="0"/>
           <w:i w:val="0"/>
           <w:color w:val="000000"/>
-          <w:sz w:val="19"/>
+          <w:sz w:val="22"/>
         </w:rPr>
         <w:t xml:space="preserve">  1.4   PROTECTED HEALTH INFORMATION (PHI) ............................................................................ 2</w:t>
       </w:r>
@@ -700,15 +700,15 @@
     <w:p>
       <w:pPr>
         <w:spacing w:line="360" w:lineRule="auto" w:after="80"/>
-        <w:jc w:val="both"/>
+        <w:jc w:val="left"/>
       </w:pPr>
       <w:r>
         <w:rPr>
-          <w:rFonts w:ascii="Courier New" w:hAnsi="Courier New"/>
+          <w:rFonts w:ascii="Times New Roman" w:hAnsi="Times New Roman"/>
           <w:b w:val="0"/>
           <w:i w:val="0"/>
           <w:color w:val="000000"/>
-          <w:sz w:val="19"/>
+          <w:sz w:val="22"/>
         </w:rPr>
         <w:t xml:space="preserve">  1.5   PRIVACY RISKS IN LARGE LANGUAGE MODEL APPLICATIONS ........................................... 2</w:t>
       </w:r>
@@ -716,15 +716,15 @@
     <w:p>
       <w:pPr>
         <w:spacing w:line="360" w:lineRule="auto" w:after="80"/>
-        <w:jc w:val="both"/>
+        <w:jc w:val="left"/>
       </w:pPr>
       <w:r>
         <w:rPr>
-          <w:rFonts w:ascii="Courier New" w:hAnsi="Courier New"/>
+          <w:rFonts w:ascii="Times New Roman" w:hAnsi="Times New Roman"/>
           <w:b w:val="0"/>
           <w:i w:val="0"/>
           <w:color w:val="000000"/>
-          <w:sz w:val="19"/>
+          <w:sz w:val="22"/>
         </w:rPr>
         <w:t xml:space="preserve">  1.6   NEED FOR AUTOMATED PHI/PII REDACTION ......................................................................... 2</w:t>
       </w:r>
@@ -732,15 +732,15 @@
     <w:p>
       <w:pPr>
         <w:spacing w:line="360" w:lineRule="auto" w:after="80"/>
-        <w:jc w:val="both"/>
+        <w:jc w:val="left"/>
       </w:pPr>
       <w:r>
         <w:rPr>
-          <w:rFonts w:ascii="Courier New" w:hAnsi="Courier New"/>
+          <w:rFonts w:ascii="Times New Roman" w:hAnsi="Times New Roman"/>
           <w:b w:val="0"/>
           <w:i w:val="0"/>
           <w:color w:val="000000"/>
-          <w:sz w:val="19"/>
+          <w:sz w:val="22"/>
         </w:rPr>
         <w:t xml:space="preserve">  1.7   PROBLEM STATEMENT ..................................................................................................... 2</w:t>
       </w:r>
@@ -748,15 +748,15 @@
     <w:p>
       <w:pPr>
         <w:spacing w:line="360" w:lineRule="auto" w:after="80"/>
-        <w:jc w:val="both"/>
+        <w:jc w:val="left"/>
       </w:pPr>
       <w:r>
         <w:rPr>
-          <w:rFonts w:ascii="Courier New" w:hAnsi="Courier New"/>
+          <w:rFonts w:ascii="Times New Roman" w:hAnsi="Times New Roman"/>
           <w:b w:val="0"/>
           <w:i w:val="0"/>
           <w:color w:val="000000"/>
-          <w:sz w:val="19"/>
+          <w:sz w:val="22"/>
         </w:rPr>
         <w:t xml:space="preserve">  1.8   OBJECTIVES OF THE PROJECT ......................................................................................... 3</w:t>
       </w:r>
@@ -764,15 +764,15 @@
     <w:p>
       <w:pPr>
         <w:spacing w:line="360" w:lineRule="auto" w:after="80"/>
-        <w:jc w:val="both"/>
+        <w:jc w:val="left"/>
       </w:pPr>
       <w:r>
         <w:rPr>
-          <w:rFonts w:ascii="Courier New" w:hAnsi="Courier New"/>
+          <w:rFonts w:ascii="Times New Roman" w:hAnsi="Times New Roman"/>
           <w:b w:val="0"/>
           <w:i w:val="0"/>
           <w:color w:val="000000"/>
-          <w:sz w:val="19"/>
+          <w:sz w:val="22"/>
         </w:rPr>
         <w:t xml:space="preserve">  1.9   SCOPE OF THE PROJECT ................................................................................................. 3</w:t>
       </w:r>
@@ -780,15 +780,15 @@
     <w:p>
       <w:pPr>
         <w:spacing w:line="360" w:lineRule="auto" w:after="80"/>
-        <w:jc w:val="both"/>
+        <w:jc w:val="left"/>
       </w:pPr>
       <w:r>
         <w:rPr>
-          <w:rFonts w:ascii="Courier New" w:hAnsi="Courier New"/>
+          <w:rFonts w:ascii="Times New Roman" w:hAnsi="Times New Roman"/>
           <w:b w:val="0"/>
           <w:i w:val="0"/>
           <w:color w:val="000000"/>
-          <w:sz w:val="19"/>
+          <w:sz w:val="22"/>
         </w:rPr>
         <w:t>CHAPTER 2 — PROJECT DEFINITION .......................................................................................... 4</w:t>
       </w:r>
@@ -796,15 +796,15 @@
     <w:p>
       <w:pPr>
         <w:spacing w:line="360" w:lineRule="auto" w:after="80"/>
-        <w:jc w:val="both"/>
+        <w:jc w:val="left"/>
       </w:pPr>
       <w:r>
         <w:rPr>
-          <w:rFonts w:ascii="Courier New" w:hAnsi="Courier New"/>
+          <w:rFonts w:ascii="Times New Roman" w:hAnsi="Times New Roman"/>
           <w:b w:val="0"/>
           <w:i w:val="0"/>
           <w:color w:val="000000"/>
-          <w:sz w:val="19"/>
+          <w:sz w:val="22"/>
         </w:rPr>
         <w:t xml:space="preserve">  2.1   PROJECT OVERVIEW .......................................................................................................... 4</w:t>
       </w:r>
@@ -812,15 +812,15 @@
     <w:p>
       <w:pPr>
         <w:spacing w:line="360" w:lineRule="auto" w:after="80"/>
-        <w:jc w:val="both"/>
+        <w:jc w:val="left"/>
       </w:pPr>
       <w:r>
         <w:rPr>
-          <w:rFonts w:ascii="Courier New" w:hAnsi="Courier New"/>
+          <w:rFonts w:ascii="Times New Roman" w:hAnsi="Times New Roman"/>
           <w:b w:val="0"/>
           <w:i w:val="0"/>
           <w:color w:val="000000"/>
-          <w:sz w:val="19"/>
+          <w:sz w:val="22"/>
         </w:rPr>
         <w:t xml:space="preserve">  2.2   EXISTING SYSTEM ........................................................................................................... 4</w:t>
       </w:r>
@@ -828,15 +828,15 @@
     <w:p>
       <w:pPr>
         <w:spacing w:line="360" w:lineRule="auto" w:after="80"/>
-        <w:jc w:val="both"/>
+        <w:jc w:val="left"/>
       </w:pPr>
       <w:r>
         <w:rPr>
-          <w:rFonts w:ascii="Courier New" w:hAnsi="Courier New"/>
+          <w:rFonts w:ascii="Times New Roman" w:hAnsi="Times New Roman"/>
           <w:b w:val="0"/>
           <w:i w:val="0"/>
           <w:color w:val="000000"/>
-          <w:sz w:val="19"/>
+          <w:sz w:val="22"/>
         </w:rPr>
         <w:t xml:space="preserve">  2.3   PROPOSED SYSTEM ........................................................................................................... 4</w:t>
       </w:r>
@@ -844,15 +844,15 @@
     <w:p>
       <w:pPr>
         <w:spacing w:line="360" w:lineRule="auto" w:after="80"/>
-        <w:jc w:val="both"/>
+        <w:jc w:val="left"/>
       </w:pPr>
       <w:r>
         <w:rPr>
-          <w:rFonts w:ascii="Courier New" w:hAnsi="Courier New"/>
+          <w:rFonts w:ascii="Times New Roman" w:hAnsi="Times New Roman"/>
           <w:b w:val="0"/>
           <w:i w:val="0"/>
           <w:color w:val="000000"/>
-          <w:sz w:val="19"/>
+          <w:sz w:val="22"/>
         </w:rPr>
         <w:t xml:space="preserve">  2.4   TECHNOLOGY STACK ......................................................................................................... 4</w:t>
       </w:r>
@@ -860,15 +860,15 @@
     <w:p>
       <w:pPr>
         <w:spacing w:line="360" w:lineRule="auto" w:after="80"/>
-        <w:jc w:val="both"/>
+        <w:jc w:val="left"/>
       </w:pPr>
       <w:r>
         <w:rPr>
-          <w:rFonts w:ascii="Courier New" w:hAnsi="Courier New"/>
+          <w:rFonts w:ascii="Times New Roman" w:hAnsi="Times New Roman"/>
           <w:b w:val="0"/>
           <w:i w:val="0"/>
           <w:color w:val="000000"/>
-          <w:sz w:val="19"/>
+          <w:sz w:val="22"/>
         </w:rPr>
         <w:t xml:space="preserve">  2.5   KEY FEATURES OF THE SYSTEM ......................................................................................... 5</w:t>
       </w:r>
@@ -876,15 +876,15 @@
     <w:p>
       <w:pPr>
         <w:spacing w:line="360" w:lineRule="auto" w:after="80"/>
-        <w:jc w:val="both"/>
+        <w:jc w:val="left"/>
       </w:pPr>
       <w:r>
         <w:rPr>
-          <w:rFonts w:ascii="Courier New" w:hAnsi="Courier New"/>
+          <w:rFonts w:ascii="Times New Roman" w:hAnsi="Times New Roman"/>
           <w:b w:val="0"/>
           <w:i w:val="0"/>
           <w:color w:val="000000"/>
-          <w:sz w:val="19"/>
+          <w:sz w:val="22"/>
         </w:rPr>
         <w:t>CHAPTER 3 — SYSTEM REQUIREMENTS ..................................................................................... 6</w:t>
       </w:r>
@@ -892,15 +892,15 @@
     <w:p>
       <w:pPr>
         <w:spacing w:line="360" w:lineRule="auto" w:after="80"/>
-        <w:jc w:val="both"/>
+        <w:jc w:val="left"/>
       </w:pPr>
       <w:r>
         <w:rPr>
-          <w:rFonts w:ascii="Courier New" w:hAnsi="Courier New"/>
+          <w:rFonts w:ascii="Times New Roman" w:hAnsi="Times New Roman"/>
           <w:b w:val="0"/>
           <w:i w:val="0"/>
           <w:color w:val="000000"/>
-          <w:sz w:val="19"/>
+          <w:sz w:val="22"/>
         </w:rPr>
         <w:t xml:space="preserve">  3.1   SOFTWARE REQUIREMENTS ................................................................................................ 6</w:t>
       </w:r>
@@ -908,15 +908,15 @@
     <w:p>
       <w:pPr>
         <w:spacing w:line="360" w:lineRule="auto" w:after="80"/>
-        <w:jc w:val="both"/>
+        <w:jc w:val="left"/>
       </w:pPr>
       <w:r>
         <w:rPr>
-          <w:rFonts w:ascii="Courier New" w:hAnsi="Courier New"/>
+          <w:rFonts w:ascii="Times New Roman" w:hAnsi="Times New Roman"/>
           <w:b w:val="0"/>
           <w:i w:val="0"/>
           <w:color w:val="000000"/>
-          <w:sz w:val="19"/>
+          <w:sz w:val="22"/>
         </w:rPr>
         <w:t xml:space="preserve">  3.2   HARDWARE REQUIREMENTS ................................................................................................ 6</w:t>
       </w:r>
@@ -924,15 +924,15 @@
     <w:p>
       <w:pPr>
         <w:spacing w:line="360" w:lineRule="auto" w:after="80"/>
-        <w:jc w:val="both"/>
+        <w:jc w:val="left"/>
       </w:pPr>
       <w:r>
         <w:rPr>
-          <w:rFonts w:ascii="Courier New" w:hAnsi="Courier New"/>
+          <w:rFonts w:ascii="Times New Roman" w:hAnsi="Times New Roman"/>
           <w:b w:val="0"/>
           <w:i w:val="0"/>
           <w:color w:val="000000"/>
-          <w:sz w:val="19"/>
+          <w:sz w:val="22"/>
         </w:rPr>
         <w:t xml:space="preserve">  3.3   DEVELOPMENT AND VALIDATION TOOLS ........................................................................... 7</w:t>
       </w:r>
@@ -940,15 +940,15 @@
     <w:p>
       <w:pPr>
         <w:spacing w:line="360" w:lineRule="auto" w:after="80"/>
-        <w:jc w:val="both"/>
+        <w:jc w:val="left"/>
       </w:pPr>
       <w:r>
         <w:rPr>
-          <w:rFonts w:ascii="Courier New" w:hAnsi="Courier New"/>
+          <w:rFonts w:ascii="Times New Roman" w:hAnsi="Times New Roman"/>
           <w:b w:val="0"/>
           <w:i w:val="0"/>
           <w:color w:val="000000"/>
-          <w:sz w:val="19"/>
+          <w:sz w:val="22"/>
         </w:rPr>
         <w:t>CHAPTER 4 — SYSTEM DESIGN AND ARCHITECTURE ............................................................... 8</w:t>
       </w:r>
@@ -956,15 +956,15 @@
     <w:p>
       <w:pPr>
         <w:spacing w:line="360" w:lineRule="auto" w:after="80"/>
-        <w:jc w:val="both"/>
+        <w:jc w:val="left"/>
       </w:pPr>
       <w:r>
         <w:rPr>
-          <w:rFonts w:ascii="Courier New" w:hAnsi="Courier New"/>
+          <w:rFonts w:ascii="Times New Roman" w:hAnsi="Times New Roman"/>
           <w:b w:val="0"/>
           <w:i w:val="0"/>
           <w:color w:val="000000"/>
-          <w:sz w:val="19"/>
+          <w:sz w:val="22"/>
         </w:rPr>
         <w:t xml:space="preserve">  4.1   SYSTEM ARCHITECTURE .................................................................................................... 8</w:t>
       </w:r>
@@ -972,15 +972,15 @@
     <w:p>
       <w:pPr>
         <w:spacing w:line="360" w:lineRule="auto" w:after="80"/>
-        <w:jc w:val="both"/>
+        <w:jc w:val="left"/>
       </w:pPr>
       <w:r>
         <w:rPr>
-          <w:rFonts w:ascii="Courier New" w:hAnsi="Courier New"/>
+          <w:rFonts w:ascii="Times New Roman" w:hAnsi="Times New Roman"/>
           <w:b w:val="0"/>
           <w:i w:val="0"/>
           <w:color w:val="000000"/>
-          <w:sz w:val="19"/>
+          <w:sz w:val="22"/>
         </w:rPr>
         <w:t xml:space="preserve">  4.2   SYSTEM WORKFLOW ........................................................................................................... 8</w:t>
       </w:r>
@@ -988,15 +988,15 @@
     <w:p>
       <w:pPr>
         <w:spacing w:line="360" w:lineRule="auto" w:after="80"/>
-        <w:jc w:val="both"/>
+        <w:jc w:val="left"/>
       </w:pPr>
       <w:r>
         <w:rPr>
-          <w:rFonts w:ascii="Courier New" w:hAnsi="Courier New"/>
+          <w:rFonts w:ascii="Times New Roman" w:hAnsi="Times New Roman"/>
           <w:b w:val="0"/>
           <w:i w:val="0"/>
           <w:color w:val="000000"/>
-          <w:sz w:val="19"/>
+          <w:sz w:val="22"/>
         </w:rPr>
         <w:t xml:space="preserve">  4.3   DATABASE DESIGN ............................................................................................................. 9</w:t>
       </w:r>
@@ -1004,15 +1004,15 @@
     <w:p>
       <w:pPr>
         <w:spacing w:line="360" w:lineRule="auto" w:after="80"/>
-        <w:jc w:val="both"/>
+        <w:jc w:val="left"/>
       </w:pPr>
       <w:r>
         <w:rPr>
-          <w:rFonts w:ascii="Courier New" w:hAnsi="Courier New"/>
+          <w:rFonts w:ascii="Times New Roman" w:hAnsi="Times New Roman"/>
           <w:b w:val="0"/>
           <w:i w:val="0"/>
           <w:color w:val="000000"/>
-          <w:sz w:val="19"/>
+          <w:sz w:val="22"/>
         </w:rPr>
         <w:t xml:space="preserve">  4.4   SECURITY ARCHITECTURE ................................................................................................... 10</w:t>
       </w:r>
@@ -1020,15 +1020,15 @@
     <w:p>
       <w:pPr>
         <w:spacing w:line="360" w:lineRule="auto" w:after="80"/>
-        <w:jc w:val="both"/>
+        <w:jc w:val="left"/>
       </w:pPr>
       <w:r>
         <w:rPr>
-          <w:rFonts w:ascii="Courier New" w:hAnsi="Courier New"/>
+          <w:rFonts w:ascii="Times New Roman" w:hAnsi="Times New Roman"/>
           <w:b w:val="0"/>
           <w:i w:val="0"/>
           <w:color w:val="000000"/>
-          <w:sz w:val="19"/>
+          <w:sz w:val="22"/>
         </w:rPr>
         <w:t>CHAPTER 5 — SYSTEM IMPLEMENTATION .................................................................................. 12</w:t>
       </w:r>
@@ -1036,15 +1036,15 @@
     <w:p>
       <w:pPr>
         <w:spacing w:line="360" w:lineRule="auto" w:after="80"/>
-        <w:jc w:val="both"/>
+        <w:jc w:val="left"/>
       </w:pPr>
       <w:r>
         <w:rPr>
-          <w:rFonts w:ascii="Courier New" w:hAnsi="Courier New"/>
+          <w:rFonts w:ascii="Times New Roman" w:hAnsi="Times New Roman"/>
           <w:b w:val="0"/>
           <w:i w:val="0"/>
           <w:color w:val="000000"/>
-          <w:sz w:val="19"/>
+          <w:sz w:val="22"/>
         </w:rPr>
         <w:t xml:space="preserve">  5.1   FRONTEND IMPLEMENTATION ........................................................................................... 12</w:t>
       </w:r>
@@ -1052,15 +1052,15 @@
     <w:p>
       <w:pPr>
         <w:spacing w:line="360" w:lineRule="auto" w:after="80"/>
-        <w:jc w:val="both"/>
+        <w:jc w:val="left"/>
       </w:pPr>
       <w:r>
         <w:rPr>
-          <w:rFonts w:ascii="Courier New" w:hAnsi="Courier New"/>
+          <w:rFonts w:ascii="Times New Roman" w:hAnsi="Times New Roman"/>
           <w:b w:val="0"/>
           <w:i w:val="0"/>
           <w:color w:val="000000"/>
-          <w:sz w:val="19"/>
+          <w:sz w:val="22"/>
         </w:rPr>
         <w:t xml:space="preserve">  5.2   BACKEND IMPLEMENTATION ........................................................................................... 12</w:t>
       </w:r>
@@ -1068,15 +1068,15 @@
     <w:p>
       <w:pPr>
         <w:spacing w:line="360" w:lineRule="auto" w:after="80"/>
-        <w:jc w:val="both"/>
+        <w:jc w:val="left"/>
       </w:pPr>
       <w:r>
         <w:rPr>
-          <w:rFonts w:ascii="Courier New" w:hAnsi="Courier New"/>
+          <w:rFonts w:ascii="Times New Roman" w:hAnsi="Times New Roman"/>
           <w:b w:val="0"/>
           <w:i w:val="0"/>
           <w:color w:val="000000"/>
-          <w:sz w:val="19"/>
+          <w:sz w:val="22"/>
         </w:rPr>
         <w:t xml:space="preserve">  5.3   VAULT &amp; TOKEN STORAGE IMPLEMENTATION ........................................................................... 13</w:t>
       </w:r>
@@ -1084,15 +1084,15 @@
     <w:p>
       <w:pPr>
         <w:spacing w:line="360" w:lineRule="auto" w:after="80"/>
-        <w:jc w:val="both"/>
+        <w:jc w:val="left"/>
       </w:pPr>
       <w:r>
         <w:rPr>
-          <w:rFonts w:ascii="Courier New" w:hAnsi="Courier New"/>
+          <w:rFonts w:ascii="Times New Roman" w:hAnsi="Times New Roman"/>
           <w:b w:val="0"/>
           <w:i w:val="0"/>
           <w:color w:val="000000"/>
-          <w:sz w:val="19"/>
+          <w:sz w:val="22"/>
         </w:rPr>
         <w:t xml:space="preserve">  5.4   MACHINE LEARNING &amp; EPONYMS IMPLEMENTATION ........................................................... 14</w:t>
       </w:r>
@@ -1100,15 +1100,15 @@
     <w:p>
       <w:pPr>
         <w:spacing w:line="360" w:lineRule="auto" w:after="80"/>
-        <w:jc w:val="both"/>
+        <w:jc w:val="left"/>
       </w:pPr>
       <w:r>
         <w:rPr>
-          <w:rFonts w:ascii="Courier New" w:hAnsi="Courier New"/>
+          <w:rFonts w:ascii="Times New Roman" w:hAnsi="Times New Roman"/>
           <w:b w:val="0"/>
           <w:i w:val="0"/>
           <w:color w:val="000000"/>
-          <w:sz w:val="19"/>
+          <w:sz w:val="22"/>
         </w:rPr>
         <w:t xml:space="preserve">  5.5   IMPLEMENTATION CHALLENGES &amp; SOLUTIONS .................................................................. 15</w:t>
       </w:r>
@@ -1116,15 +1116,15 @@
     <w:p>
       <w:pPr>
         <w:spacing w:line="360" w:lineRule="auto" w:after="80"/>
-        <w:jc w:val="both"/>
+        <w:jc w:val="left"/>
       </w:pPr>
       <w:r>
         <w:rPr>
-          <w:rFonts w:ascii="Courier New" w:hAnsi="Courier New"/>
+          <w:rFonts w:ascii="Times New Roman" w:hAnsi="Times New Roman"/>
           <w:b w:val="0"/>
           <w:i w:val="0"/>
           <w:color w:val="000000"/>
-          <w:sz w:val="19"/>
+          <w:sz w:val="22"/>
         </w:rPr>
         <w:t>CHAPTER 6 — WORKFLOW AND MAJOR FUNCTIONALITY ........................................................... 17</w:t>
       </w:r>
@@ -1132,15 +1132,15 @@
     <w:p>
       <w:pPr>
         <w:spacing w:line="360" w:lineRule="auto" w:after="80"/>
-        <w:jc w:val="both"/>
+        <w:jc w:val="left"/>
       </w:pPr>
       <w:r>
         <w:rPr>
-          <w:rFonts w:ascii="Courier New" w:hAnsi="Courier New"/>
+          <w:rFonts w:ascii="Times New Roman" w:hAnsi="Times New Roman"/>
           <w:b w:val="0"/>
           <w:i w:val="0"/>
           <w:color w:val="000000"/>
-          <w:sz w:val="19"/>
+          <w:sz w:val="22"/>
         </w:rPr>
         <w:t xml:space="preserve">  6.1   MAIN REQUEST LIFECYCLE ................................................................................................ 17</w:t>
       </w:r>
@@ -1148,15 +1148,15 @@
     <w:p>
       <w:pPr>
         <w:spacing w:line="360" w:lineRule="auto" w:after="80"/>
-        <w:jc w:val="both"/>
+        <w:jc w:val="left"/>
       </w:pPr>
       <w:r>
         <w:rPr>
-          <w:rFonts w:ascii="Courier New" w:hAnsi="Courier New"/>
+          <w:rFonts w:ascii="Times New Roman" w:hAnsi="Times New Roman"/>
           <w:b w:val="0"/>
           <w:i w:val="0"/>
           <w:color w:val="000000"/>
-          <w:sz w:val="19"/>
+          <w:sz w:val="22"/>
         </w:rPr>
         <w:t xml:space="preserve">  6.2   REGEX SCANNING &amp; OVERLAP RESOLUTION ......................................................................... 17</w:t>
       </w:r>
@@ -1164,15 +1164,15 @@
     <w:p>
       <w:pPr>
         <w:spacing w:line="360" w:lineRule="auto" w:after="80"/>
-        <w:jc w:val="both"/>
+        <w:jc w:val="left"/>
       </w:pPr>
       <w:r>
         <w:rPr>
-          <w:rFonts w:ascii="Courier New" w:hAnsi="Courier New"/>
+          <w:rFonts w:ascii="Times New Roman" w:hAnsi="Times New Roman"/>
           <w:b w:val="0"/>
           <w:i w:val="0"/>
           <w:color w:val="000000"/>
-          <w:sz w:val="19"/>
+          <w:sz w:val="22"/>
         </w:rPr>
         <w:t xml:space="preserve">  6.3   TOKEN GENERATION &amp; DE-IDENTIFICATION ........................................................................... 18</w:t>
       </w:r>
@@ -1180,15 +1180,15 @@
     <w:p>
       <w:pPr>
         <w:spacing w:line="360" w:lineRule="auto" w:after="80"/>
-        <w:jc w:val="both"/>
+        <w:jc w:val="left"/>
       </w:pPr>
       <w:r>
         <w:rPr>
-          <w:rFonts w:ascii="Courier New" w:hAnsi="Courier New"/>
+          <w:rFonts w:ascii="Times New Roman" w:hAnsi="Times New Roman"/>
           <w:b w:val="0"/>
           <w:i w:val="0"/>
           <w:color w:val="000000"/>
-          <w:sz w:val="19"/>
+          <w:sz w:val="22"/>
         </w:rPr>
         <w:t xml:space="preserve">  6.4   LLM INTERACTION &amp; IDENTITY RESTORATION ........................................................................... 19</w:t>
       </w:r>
@@ -1196,15 +1196,15 @@
     <w:p>
       <w:pPr>
         <w:spacing w:line="360" w:lineRule="auto" w:after="80"/>
-        <w:jc w:val="both"/>
+        <w:jc w:val="left"/>
       </w:pPr>
       <w:r>
         <w:rPr>
-          <w:rFonts w:ascii="Courier New" w:hAnsi="Courier New"/>
+          <w:rFonts w:ascii="Times New Roman" w:hAnsi="Times New Roman"/>
           <w:b w:val="0"/>
           <w:i w:val="0"/>
           <w:color w:val="000000"/>
-          <w:sz w:val="19"/>
+          <w:sz w:val="22"/>
         </w:rPr>
         <w:t xml:space="preserve">  6.5   AUDIT TRAIL LOGGING ................................................................................................ 20</w:t>
       </w:r>
@@ -1212,15 +1212,15 @@
     <w:p>
       <w:pPr>
         <w:spacing w:line="360" w:lineRule="auto" w:after="80"/>
-        <w:jc w:val="both"/>
+        <w:jc w:val="left"/>
       </w:pPr>
       <w:r>
         <w:rPr>
-          <w:rFonts w:ascii="Courier New" w:hAnsi="Courier New"/>
+          <w:rFonts w:ascii="Times New Roman" w:hAnsi="Times New Roman"/>
           <w:b w:val="0"/>
           <w:i w:val="0"/>
           <w:color w:val="000000"/>
-          <w:sz w:val="19"/>
+          <w:sz w:val="22"/>
         </w:rPr>
         <w:t>CHAPTER 7 — TESTING AND VALIDATION ................................................................................ 21</w:t>
       </w:r>
@@ -1228,15 +1228,15 @@
     <w:p>
       <w:pPr>
         <w:spacing w:line="360" w:lineRule="auto" w:after="80"/>
-        <w:jc w:val="both"/>
+        <w:jc w:val="left"/>
       </w:pPr>
       <w:r>
         <w:rPr>
-          <w:rFonts w:ascii="Courier New" w:hAnsi="Courier New"/>
+          <w:rFonts w:ascii="Times New Roman" w:hAnsi="Times New Roman"/>
           <w:b w:val="0"/>
           <w:i w:val="0"/>
           <w:color w:val="000000"/>
-          <w:sz w:val="19"/>
+          <w:sz w:val="22"/>
         </w:rPr>
         <w:t xml:space="preserve">  7.1   TESTING OBJECTIVES .................................................................................................. 21</w:t>
       </w:r>
@@ -1244,15 +1244,15 @@
     <w:p>
       <w:pPr>
         <w:spacing w:line="360" w:lineRule="auto" w:after="80"/>
-        <w:jc w:val="both"/>
+        <w:jc w:val="left"/>
       </w:pPr>
       <w:r>
         <w:rPr>
-          <w:rFonts w:ascii="Courier New" w:hAnsi="Courier New"/>
+          <w:rFonts w:ascii="Times New Roman" w:hAnsi="Times New Roman"/>
           <w:b w:val="0"/>
           <w:i w:val="0"/>
           <w:color w:val="000000"/>
-          <w:sz w:val="19"/>
+          <w:sz w:val="22"/>
         </w:rPr>
         <w:t xml:space="preserve">  7.2   TESTING STRATEGY ........................................................................................................... 21</w:t>
       </w:r>
@@ -1260,15 +1260,15 @@
     <w:p>
       <w:pPr>
         <w:spacing w:line="360" w:lineRule="auto" w:after="80"/>
-        <w:jc w:val="both"/>
+        <w:jc w:val="left"/>
       </w:pPr>
       <w:r>
         <w:rPr>
-          <w:rFonts w:ascii="Courier New" w:hAnsi="Courier New"/>
+          <w:rFonts w:ascii="Times New Roman" w:hAnsi="Times New Roman"/>
           <w:b w:val="0"/>
           <w:i w:val="0"/>
           <w:color w:val="000000"/>
-          <w:sz w:val="19"/>
+          <w:sz w:val="22"/>
         </w:rPr>
         <w:t xml:space="preserve">  7.3   UNIT TESTING .................................................................................................................. 21</w:t>
       </w:r>
@@ -1276,15 +1276,15 @@
     <w:p>
       <w:pPr>
         <w:spacing w:line="360" w:lineRule="auto" w:after="80"/>
-        <w:jc w:val="both"/>
+        <w:jc w:val="left"/>
       </w:pPr>
       <w:r>
         <w:rPr>
-          <w:rFonts w:ascii="Courier New" w:hAnsi="Courier New"/>
+          <w:rFonts w:ascii="Times New Roman" w:hAnsi="Times New Roman"/>
           <w:b w:val="0"/>
           <w:i w:val="0"/>
           <w:color w:val="000000"/>
-          <w:sz w:val="19"/>
+          <w:sz w:val="22"/>
         </w:rPr>
         <w:t xml:space="preserve">  7.4   INTEGRATION TESTING ........................................................................................................... 22</w:t>
       </w:r>
@@ -1292,15 +1292,15 @@
     <w:p>
       <w:pPr>
         <w:spacing w:line="360" w:lineRule="auto" w:after="80"/>
-        <w:jc w:val="both"/>
+        <w:jc w:val="left"/>
       </w:pPr>
       <w:r>
         <w:rPr>
-          <w:rFonts w:ascii="Courier New" w:hAnsi="Courier New"/>
+          <w:rFonts w:ascii="Times New Roman" w:hAnsi="Times New Roman"/>
           <w:b w:val="0"/>
           <w:i w:val="0"/>
           <w:color w:val="000000"/>
-          <w:sz w:val="19"/>
+          <w:sz w:val="22"/>
         </w:rPr>
         <w:t xml:space="preserve">  7.5   TEST CASES &amp; RESULTS ..................................................................................................... 22</w:t>
       </w:r>
@@ -1308,15 +1308,15 @@
     <w:p>
       <w:pPr>
         <w:spacing w:line="360" w:lineRule="auto" w:after="80"/>
-        <w:jc w:val="both"/>
+        <w:jc w:val="left"/>
       </w:pPr>
       <w:r>
         <w:rPr>
-          <w:rFonts w:ascii="Courier New" w:hAnsi="Courier New"/>
+          <w:rFonts w:ascii="Times New Roman" w:hAnsi="Times New Roman"/>
           <w:b w:val="0"/>
           <w:i w:val="0"/>
           <w:color w:val="000000"/>
-          <w:sz w:val="19"/>
+          <w:sz w:val="22"/>
         </w:rPr>
         <w:t>CHAPTER 8 — RESULTS AND OUTPUTS ..................................................................................... 23</w:t>
       </w:r>
@@ -1324,15 +1324,15 @@
     <w:p>
       <w:pPr>
         <w:spacing w:line="360" w:lineRule="auto" w:after="80"/>
-        <w:jc w:val="both"/>
+        <w:jc w:val="left"/>
       </w:pPr>
       <w:r>
         <w:rPr>
-          <w:rFonts w:ascii="Courier New" w:hAnsi="Courier New"/>
+          <w:rFonts w:ascii="Times New Roman" w:hAnsi="Times New Roman"/>
           <w:b w:val="0"/>
           <w:i w:val="0"/>
           <w:color w:val="000000"/>
-          <w:sz w:val="19"/>
+          <w:sz w:val="22"/>
         </w:rPr>
         <w:t xml:space="preserve">  8.1   APPLICATION STARTUP &amp; CONFIGURATION ........................................................................... 23</w:t>
       </w:r>
@@ -1340,15 +1340,15 @@
     <w:p>
       <w:pPr>
         <w:spacing w:line="360" w:lineRule="auto" w:after="80"/>
-        <w:jc w:val="both"/>
+        <w:jc w:val="left"/>
       </w:pPr>
       <w:r>
         <w:rPr>
-          <w:rFonts w:ascii="Courier New" w:hAnsi="Courier New"/>
+          <w:rFonts w:ascii="Times New Roman" w:hAnsi="Times New Roman"/>
           <w:b w:val="0"/>
           <w:i w:val="0"/>
           <w:color w:val="000000"/>
-          <w:sz w:val="19"/>
+          <w:sz w:val="22"/>
         </w:rPr>
         <w:t xml:space="preserve">  8.2   MAIN GATEWAY USER INTERFACE ........................................................................................ 23</w:t>
       </w:r>
@@ -1356,15 +1356,15 @@
     <w:p>
       <w:pPr>
         <w:spacing w:line="360" w:lineRule="auto" w:after="80"/>
-        <w:jc w:val="both"/>
+        <w:jc w:val="left"/>
       </w:pPr>
       <w:r>
         <w:rPr>
-          <w:rFonts w:ascii="Courier New" w:hAnsi="Courier New"/>
+          <w:rFonts w:ascii="Times New Roman" w:hAnsi="Times New Roman"/>
           <w:b w:val="0"/>
           <w:i w:val="0"/>
           <w:color w:val="000000"/>
-          <w:sz w:val="19"/>
+          <w:sz w:val="22"/>
         </w:rPr>
         <w:t xml:space="preserve">  8.3   INPUT NOTE DE-IDENTIFICATION RUN ................................................................................... 23</w:t>
       </w:r>
@@ -1372,15 +1372,15 @@
     <w:p>
       <w:pPr>
         <w:spacing w:line="360" w:lineRule="auto" w:after="80"/>
-        <w:jc w:val="both"/>
+        <w:jc w:val="left"/>
       </w:pPr>
       <w:r>
         <w:rPr>
-          <w:rFonts w:ascii="Courier New" w:hAnsi="Courier New"/>
+          <w:rFonts w:ascii="Times New Roman" w:hAnsi="Times New Roman"/>
           <w:b w:val="0"/>
           <w:i w:val="0"/>
           <w:color w:val="000000"/>
-          <w:sz w:val="19"/>
+          <w:sz w:val="22"/>
         </w:rPr>
         <w:t xml:space="preserve">  8.4   RESTORATION &amp; DYNAMIC AI RESPONSE ................................................................................... 24</w:t>
       </w:r>
@@ -1388,15 +1388,15 @@
     <w:p>
       <w:pPr>
         <w:spacing w:line="360" w:lineRule="auto" w:after="80"/>
-        <w:jc w:val="both"/>
+        <w:jc w:val="left"/>
       </w:pPr>
       <w:r>
         <w:rPr>
-          <w:rFonts w:ascii="Courier New" w:hAnsi="Courier New"/>
+          <w:rFonts w:ascii="Times New Roman" w:hAnsi="Times New Roman"/>
           <w:b w:val="0"/>
           <w:i w:val="0"/>
           <w:color w:val="000000"/>
-          <w:sz w:val="19"/>
+          <w:sz w:val="22"/>
         </w:rPr>
         <w:t xml:space="preserve">  8.5   AUDIT LOGS &amp; COMPLIANCE METRICS ................................................................................... 25</w:t>
       </w:r>
@@ -1404,15 +1404,15 @@
     <w:p>
       <w:pPr>
         <w:spacing w:line="360" w:lineRule="auto" w:after="80"/>
-        <w:jc w:val="both"/>
+        <w:jc w:val="left"/>
       </w:pPr>
       <w:r>
         <w:rPr>
-          <w:rFonts w:ascii="Courier New" w:hAnsi="Courier New"/>
+          <w:rFonts w:ascii="Times New Roman" w:hAnsi="Times New Roman"/>
           <w:b w:val="0"/>
           <w:i w:val="0"/>
           <w:color w:val="000000"/>
-          <w:sz w:val="19"/>
+          <w:sz w:val="22"/>
         </w:rPr>
         <w:t>CHAPTER 9 — SECURITY, PRIVACY, AND LIMITATIONS ............................................................. 28</w:t>
       </w:r>
@@ -1420,15 +1420,15 @@
     <w:p>
       <w:pPr>
         <w:spacing w:line="360" w:lineRule="auto" w:after="80"/>
-        <w:jc w:val="both"/>
+        <w:jc w:val="left"/>
       </w:pPr>
       <w:r>
         <w:rPr>
-          <w:rFonts w:ascii="Courier New" w:hAnsi="Courier New"/>
+          <w:rFonts w:ascii="Times New Roman" w:hAnsi="Times New Roman"/>
           <w:b w:val="0"/>
           <w:i w:val="0"/>
           <w:color w:val="000000"/>
-          <w:sz w:val="19"/>
+          <w:sz w:val="22"/>
         </w:rPr>
         <w:t xml:space="preserve">  9.1   TECHNICAL LIMITATIONS .................................................................................................. 28</w:t>
       </w:r>
@@ -1436,15 +1436,15 @@
     <w:p>
       <w:pPr>
         <w:spacing w:line="360" w:lineRule="auto" w:after="80"/>
-        <w:jc w:val="both"/>
+        <w:jc w:val="left"/>
       </w:pPr>
       <w:r>
         <w:rPr>
-          <w:rFonts w:ascii="Courier New" w:hAnsi="Courier New"/>
+          <w:rFonts w:ascii="Times New Roman" w:hAnsi="Times New Roman"/>
           <w:b w:val="0"/>
           <w:i w:val="0"/>
           <w:color w:val="000000"/>
-          <w:sz w:val="19"/>
+          <w:sz w:val="22"/>
         </w:rPr>
         <w:t xml:space="preserve">  9.2   SYSTEM AND SCALABILITY LIMITATIONS .................................................................................. 28</w:t>
       </w:r>
@@ -1452,15 +1452,15 @@
     <w:p>
       <w:pPr>
         <w:spacing w:line="360" w:lineRule="auto" w:after="80"/>
-        <w:jc w:val="both"/>
+        <w:jc w:val="left"/>
       </w:pPr>
       <w:r>
         <w:rPr>
-          <w:rFonts w:ascii="Courier New" w:hAnsi="Courier New"/>
+          <w:rFonts w:ascii="Times New Roman" w:hAnsi="Times New Roman"/>
           <w:b w:val="0"/>
           <w:i w:val="0"/>
           <w:color w:val="000000"/>
-          <w:sz w:val="19"/>
+          <w:sz w:val="22"/>
         </w:rPr>
         <w:t xml:space="preserve">  9.3   SECURITY LIMITATIONS ................................................................................................... 28</w:t>
       </w:r>
@@ -1468,15 +1468,15 @@
     <w:p>
       <w:pPr>
         <w:spacing w:line="360" w:lineRule="auto" w:after="80"/>
-        <w:jc w:val="both"/>
+        <w:jc w:val="left"/>
       </w:pPr>
       <w:r>
         <w:rPr>
-          <w:rFonts w:ascii="Courier New" w:hAnsi="Courier New"/>
+          <w:rFonts w:ascii="Times New Roman" w:hAnsi="Times New Roman"/>
           <w:b w:val="0"/>
           <w:i w:val="0"/>
           <w:color w:val="000000"/>
-          <w:sz w:val="19"/>
+          <w:sz w:val="22"/>
         </w:rPr>
         <w:t>CHAPTER 10 — FUTURE ENHANCEMENTS .................................................................................. 30</w:t>
       </w:r>
@@ -1484,15 +1484,15 @@
     <w:p>
       <w:pPr>
         <w:spacing w:line="360" w:lineRule="auto" w:after="80"/>
-        <w:jc w:val="both"/>
+        <w:jc w:val="left"/>
       </w:pPr>
       <w:r>
         <w:rPr>
-          <w:rFonts w:ascii="Courier New" w:hAnsi="Courier New"/>
+          <w:rFonts w:ascii="Times New Roman" w:hAnsi="Times New Roman"/>
           <w:b w:val="0"/>
           <w:i w:val="0"/>
           <w:color w:val="000000"/>
-          <w:sz w:val="19"/>
+          <w:sz w:val="22"/>
         </w:rPr>
         <w:t xml:space="preserve">  10.1   MODEL OPTIMIZATIONS .................................................................................................. 30</w:t>
       </w:r>
@@ -1500,15 +1500,15 @@
     <w:p>
       <w:pPr>
         <w:spacing w:line="360" w:lineRule="auto" w:after="80"/>
-        <w:jc w:val="both"/>
+        <w:jc w:val="left"/>
       </w:pPr>
       <w:r>
         <w:rPr>
-          <w:rFonts w:ascii="Courier New" w:hAnsi="Courier New"/>
+          <w:rFonts w:ascii="Times New Roman" w:hAnsi="Times New Roman"/>
           <w:b w:val="0"/>
           <w:i w:val="0"/>
           <w:color w:val="000000"/>
-          <w:sz w:val="19"/>
+          <w:sz w:val="22"/>
         </w:rPr>
         <w:t xml:space="preserve">  10.2   REGULATORY COMPLIANCE ROADMAP .................................................................................. 30</w:t>
       </w:r>
@@ -1516,15 +1516,15 @@
     <w:p>
       <w:pPr>
         <w:spacing w:line="360" w:lineRule="auto" w:after="80"/>
-        <w:jc w:val="both"/>
+        <w:jc w:val="left"/>
       </w:pPr>
       <w:r>
         <w:rPr>
-          <w:rFonts w:ascii="Courier New" w:hAnsi="Courier New"/>
+          <w:rFonts w:ascii="Times New Roman" w:hAnsi="Times New Roman"/>
           <w:b w:val="0"/>
           <w:i w:val="0"/>
           <w:color w:val="000000"/>
-          <w:sz w:val="19"/>
+          <w:sz w:val="22"/>
         </w:rPr>
         <w:t>CONCLUSION ................................................................................................................................... 32</w:t>
       </w:r>
@@ -1532,15 +1532,15 @@
     <w:p>
       <w:pPr>
         <w:spacing w:line="360" w:lineRule="auto" w:after="80"/>
-        <w:jc w:val="both"/>
+        <w:jc w:val="left"/>
       </w:pPr>
       <w:r>
         <w:rPr>
-          <w:rFonts w:ascii="Courier New" w:hAnsi="Courier New"/>
+          <w:rFonts w:ascii="Times New Roman" w:hAnsi="Times New Roman"/>
           <w:b w:val="0"/>
           <w:i w:val="0"/>
           <w:color w:val="000000"/>
-          <w:sz w:val="19"/>
+          <w:sz w:val="22"/>
         </w:rPr>
         <w:t>REFERENCES ................................................................................................................................... 33</w:t>
       </w:r>
@@ -1570,15 +1570,15 @@
     <w:p>
       <w:pPr>
         <w:spacing w:line="360" w:lineRule="auto" w:after="80"/>
-        <w:jc w:val="both"/>
+        <w:jc w:val="left"/>
       </w:pPr>
       <w:r>
         <w:rPr>
-          <w:rFonts w:ascii="Courier New" w:hAnsi="Courier New"/>
+          <w:rFonts w:ascii="Times New Roman" w:hAnsi="Times New Roman"/>
           <w:b w:val="0"/>
           <w:i w:val="0"/>
           <w:color w:val="000000"/>
-          <w:sz w:val="19"/>
+          <w:sz w:val="22"/>
         </w:rPr>
         <w:t>Fig. 3.1   Local Development &amp; Validation Flowchart ................................................................ 7</w:t>
       </w:r>
@@ -1586,15 +1586,15 @@
     <w:p>
       <w:pPr>
         <w:spacing w:line="360" w:lineRule="auto" w:after="80"/>
-        <w:jc w:val="both"/>
+        <w:jc w:val="left"/>
       </w:pPr>
       <w:r>
         <w:rPr>
-          <w:rFonts w:ascii="Courier New" w:hAnsi="Courier New"/>
+          <w:rFonts w:ascii="Times New Roman" w:hAnsi="Times New Roman"/>
           <w:b w:val="0"/>
           <w:i w:val="0"/>
           <w:color w:val="000000"/>
-          <w:sz w:val="19"/>
+          <w:sz w:val="22"/>
         </w:rPr>
         <w:t>Fig. 4.1   Overall System Architecture Diagram ........................................................................................... 8</w:t>
       </w:r>
@@ -1602,15 +1602,15 @@
     <w:p>
       <w:pPr>
         <w:spacing w:line="360" w:lineRule="auto" w:after="80"/>
-        <w:jc w:val="both"/>
+        <w:jc w:val="left"/>
       </w:pPr>
       <w:r>
         <w:rPr>
-          <w:rFonts w:ascii="Courier New" w:hAnsi="Courier New"/>
+          <w:rFonts w:ascii="Times New Roman" w:hAnsi="Times New Roman"/>
           <w:b w:val="0"/>
           <w:i w:val="0"/>
           <w:color w:val="000000"/>
-          <w:sz w:val="19"/>
+          <w:sz w:val="22"/>
         </w:rPr>
         <w:t>Fig. 4.2   Hybrid Redaction Pipeline Flowchart ........................................................................................... 8</w:t>
       </w:r>
@@ -1618,15 +1618,15 @@
     <w:p>
       <w:pPr>
         <w:spacing w:line="360" w:lineRule="auto" w:after="80"/>
-        <w:jc w:val="both"/>
+        <w:jc w:val="left"/>
       </w:pPr>
       <w:r>
         <w:rPr>
-          <w:rFonts w:ascii="Courier New" w:hAnsi="Courier New"/>
+          <w:rFonts w:ascii="Times New Roman" w:hAnsi="Times New Roman"/>
           <w:b w:val="0"/>
           <w:i w:val="0"/>
           <w:color w:val="000000"/>
-          <w:sz w:val="19"/>
+          <w:sz w:val="22"/>
         </w:rPr>
         <w:t>Fig. 4.3   Redis Key-Space Layout ........................................................................................... 9</w:t>
       </w:r>
@@ -1634,15 +1634,15 @@
     <w:p>
       <w:pPr>
         <w:spacing w:line="360" w:lineRule="auto" w:after="80"/>
-        <w:jc w:val="both"/>
+        <w:jc w:val="left"/>
       </w:pPr>
       <w:r>
         <w:rPr>
-          <w:rFonts w:ascii="Courier New" w:hAnsi="Courier New"/>
+          <w:rFonts w:ascii="Times New Roman" w:hAnsi="Times New Roman"/>
           <w:b w:val="0"/>
           <w:i w:val="0"/>
           <w:color w:val="000000"/>
-          <w:sz w:val="19"/>
+          <w:sz w:val="22"/>
         </w:rPr>
         <w:t>Fig. 4.4   Trust Boundary Controls Map ........................................................................................... 10</w:t>
       </w:r>
@@ -1650,15 +1650,15 @@
     <w:p>
       <w:pPr>
         <w:spacing w:line="360" w:lineRule="auto" w:after="80"/>
-        <w:jc w:val="both"/>
+        <w:jc w:val="left"/>
       </w:pPr>
       <w:r>
         <w:rPr>
-          <w:rFonts w:ascii="Courier New" w:hAnsi="Courier New"/>
+          <w:rFonts w:ascii="Times New Roman" w:hAnsi="Times New Roman"/>
           <w:b w:val="0"/>
           <w:i w:val="0"/>
           <w:color w:val="000000"/>
-          <w:sz w:val="19"/>
+          <w:sz w:val="22"/>
         </w:rPr>
         <w:t>Fig. 6.1   Audit logging path flowchart ........................................................................................... 20</w:t>
       </w:r>
@@ -1666,15 +1666,15 @@
     <w:p>
       <w:pPr>
         <w:spacing w:line="360" w:lineRule="auto" w:after="80"/>
-        <w:jc w:val="both"/>
+        <w:jc w:val="left"/>
       </w:pPr>
       <w:r>
         <w:rPr>
-          <w:rFonts w:ascii="Courier New" w:hAnsi="Courier New"/>
+          <w:rFonts w:ascii="Times New Roman" w:hAnsi="Times New Roman"/>
           <w:b w:val="0"/>
           <w:i w:val="0"/>
           <w:color w:val="000000"/>
-          <w:sz w:val="19"/>
+          <w:sz w:val="22"/>
         </w:rPr>
         <w:t>Fig. 8.1   Project Directory Tree ........................................................................................... 23</w:t>
       </w:r>
@@ -1682,15 +1682,15 @@
     <w:p>
       <w:pPr>
         <w:spacing w:line="360" w:lineRule="auto" w:after="80"/>
-        <w:jc w:val="both"/>
+        <w:jc w:val="left"/>
       </w:pPr>
       <w:r>
         <w:rPr>
-          <w:rFonts w:ascii="Courier New" w:hAnsi="Courier New"/>
+          <w:rFonts w:ascii="Times New Roman" w:hAnsi="Times New Roman"/>
           <w:b w:val="0"/>
           <w:i w:val="0"/>
           <w:color w:val="000000"/>
-          <w:sz w:val="19"/>
+          <w:sz w:val="22"/>
         </w:rPr>
         <w:t>Fig. 8.2   Flask Startup Diagnostics ........................................................................................... 23</w:t>
       </w:r>
@@ -1698,15 +1698,15 @@
     <w:p>
       <w:pPr>
         <w:spacing w:line="360" w:lineRule="auto" w:after="80"/>
-        <w:jc w:val="both"/>
+        <w:jc w:val="left"/>
       </w:pPr>
       <w:r>
         <w:rPr>
-          <w:rFonts w:ascii="Courier New" w:hAnsi="Courier New"/>
+          <w:rFonts w:ascii="Times New Roman" w:hAnsi="Times New Roman"/>
           <w:b w:val="0"/>
           <w:i w:val="0"/>
           <w:color w:val="000000"/>
-          <w:sz w:val="19"/>
+          <w:sz w:val="22"/>
         </w:rPr>
         <w:t>Fig. 8.3   Frontend Login Interface ........................................................................................... 23</w:t>
       </w:r>
@@ -1714,15 +1714,15 @@
     <w:p>
       <w:pPr>
         <w:spacing w:line="360" w:lineRule="auto" w:after="80"/>
-        <w:jc w:val="both"/>
+        <w:jc w:val="left"/>
       </w:pPr>
       <w:r>
         <w:rPr>
-          <w:rFonts w:ascii="Courier New" w:hAnsi="Courier New"/>
+          <w:rFonts w:ascii="Times New Roman" w:hAnsi="Times New Roman"/>
           <w:b w:val="0"/>
           <w:i w:val="0"/>
           <w:color w:val="000000"/>
-          <w:sz w:val="19"/>
+          <w:sz w:val="22"/>
         </w:rPr>
         <w:t>Fig. 8.4   EHR Proxy Dashboard ........................................................................................... 23</w:t>
       </w:r>
@@ -1730,15 +1730,15 @@
     <w:p>
       <w:pPr>
         <w:spacing w:line="360" w:lineRule="auto" w:after="80"/>
-        <w:jc w:val="both"/>
+        <w:jc w:val="left"/>
       </w:pPr>
       <w:r>
         <w:rPr>
-          <w:rFonts w:ascii="Courier New" w:hAnsi="Courier New"/>
+          <w:rFonts w:ascii="Times New Roman" w:hAnsi="Times New Roman"/>
           <w:b w:val="0"/>
           <w:i w:val="0"/>
           <w:color w:val="000000"/>
-          <w:sz w:val="19"/>
+          <w:sz w:val="22"/>
         </w:rPr>
         <w:t>Fig. 8.5   Clinical Note Prior to Redaction ........................................................................................... 23</w:t>
       </w:r>
@@ -1746,15 +1746,15 @@
     <w:p>
       <w:pPr>
         <w:spacing w:line="360" w:lineRule="auto" w:after="80"/>
-        <w:jc w:val="both"/>
+        <w:jc w:val="left"/>
       </w:pPr>
       <w:r>
         <w:rPr>
-          <w:rFonts w:ascii="Courier New" w:hAnsi="Courier New"/>
+          <w:rFonts w:ascii="Times New Roman" w:hAnsi="Times New Roman"/>
           <w:b w:val="0"/>
           <w:i w:val="0"/>
           <w:color w:val="000000"/>
-          <w:sz w:val="19"/>
+          <w:sz w:val="22"/>
         </w:rPr>
         <w:t>Fig. 8.6   Live Warning risk pre-check ........................................................................................... 23</w:t>
       </w:r>
@@ -1762,15 +1762,15 @@
     <w:p>
       <w:pPr>
         <w:spacing w:line="360" w:lineRule="auto" w:after="80"/>
-        <w:jc w:val="both"/>
+        <w:jc w:val="left"/>
       </w:pPr>
       <w:r>
         <w:rPr>
-          <w:rFonts w:ascii="Courier New" w:hAnsi="Courier New"/>
+          <w:rFonts w:ascii="Times New Roman" w:hAnsi="Times New Roman"/>
           <w:b w:val="0"/>
           <w:i w:val="0"/>
           <w:color w:val="000000"/>
-          <w:sz w:val="19"/>
+          <w:sz w:val="22"/>
         </w:rPr>
         <w:t>Fig. 8.7   Redacted Note with Tokens ........................................................................................... 23</w:t>
       </w:r>
@@ -1778,15 +1778,15 @@
     <w:p>
       <w:pPr>
         <w:spacing w:line="360" w:lineRule="auto" w:after="80"/>
-        <w:jc w:val="both"/>
+        <w:jc w:val="left"/>
       </w:pPr>
       <w:r>
         <w:rPr>
-          <w:rFonts w:ascii="Courier New" w:hAnsi="Courier New"/>
+          <w:rFonts w:ascii="Times New Roman" w:hAnsi="Times New Roman"/>
           <w:b w:val="0"/>
           <w:i w:val="0"/>
           <w:color w:val="000000"/>
-          <w:sz w:val="19"/>
+          <w:sz w:val="22"/>
         </w:rPr>
         <w:t>Fig. 8.8   Side-by-side Visual Diff ........................................................................................... 24</w:t>
       </w:r>
@@ -1794,15 +1794,15 @@
     <w:p>
       <w:pPr>
         <w:spacing w:line="360" w:lineRule="auto" w:after="80"/>
-        <w:jc w:val="both"/>
+        <w:jc w:val="left"/>
       </w:pPr>
       <w:r>
         <w:rPr>
-          <w:rFonts w:ascii="Courier New" w:hAnsi="Courier New"/>
+          <w:rFonts w:ascii="Times New Roman" w:hAnsi="Times New Roman"/>
           <w:b w:val="0"/>
           <w:i w:val="0"/>
           <w:color w:val="000000"/>
-          <w:sz w:val="19"/>
+          <w:sz w:val="22"/>
         </w:rPr>
         <w:t>Fig. 8.9   Fallback Summarizer Output ........................................................................................... 24</w:t>
       </w:r>
@@ -1810,15 +1810,15 @@
     <w:p>
       <w:pPr>
         <w:spacing w:line="360" w:lineRule="auto" w:after="80"/>
-        <w:jc w:val="both"/>
+        <w:jc w:val="left"/>
       </w:pPr>
       <w:r>
         <w:rPr>
-          <w:rFonts w:ascii="Courier New" w:hAnsi="Courier New"/>
+          <w:rFonts w:ascii="Times New Roman" w:hAnsi="Times New Roman"/>
           <w:b w:val="0"/>
           <w:i w:val="0"/>
           <w:color w:val="000000"/>
-          <w:sz w:val="19"/>
+          <w:sz w:val="22"/>
         </w:rPr>
         <w:t>Fig. 8.10   Mapped Active Session Keys ........................................................................................... 24</w:t>
       </w:r>
@@ -1826,15 +1826,15 @@
     <w:p>
       <w:pPr>
         <w:spacing w:line="360" w:lineRule="auto" w:after="80"/>
-        <w:jc w:val="both"/>
+        <w:jc w:val="left"/>
       </w:pPr>
       <w:r>
         <w:rPr>
-          <w:rFonts w:ascii="Courier New" w:hAnsi="Courier New"/>
+          <w:rFonts w:ascii="Times New Roman" w:hAnsi="Times New Roman"/>
           <w:b w:val="0"/>
           <w:i w:val="0"/>
           <w:color w:val="000000"/>
-          <w:sz w:val="19"/>
+          <w:sz w:val="22"/>
         </w:rPr>
         <w:t>Fig. 8.11   Anonymized audit log rows ........................................................................................... 25</w:t>
       </w:r>
@@ -1842,15 +1842,15 @@
     <w:p>
       <w:pPr>
         <w:spacing w:line="360" w:lineRule="auto" w:after="80"/>
-        <w:jc w:val="both"/>
+        <w:jc w:val="left"/>
       </w:pPr>
       <w:r>
         <w:rPr>
-          <w:rFonts w:ascii="Courier New" w:hAnsi="Courier New"/>
+          <w:rFonts w:ascii="Times New Roman" w:hAnsi="Times New Roman"/>
           <w:b w:val="0"/>
           <w:i w:val="0"/>
           <w:color w:val="000000"/>
-          <w:sz w:val="19"/>
+          <w:sz w:val="22"/>
         </w:rPr>
         <w:t>Fig. 8.12   API Rate Limiter 429 ........................................................................................... 25</w:t>
       </w:r>
@@ -1858,15 +1858,15 @@
     <w:p>
       <w:pPr>
         <w:spacing w:line="360" w:lineRule="auto" w:after="80"/>
-        <w:jc w:val="both"/>
+        <w:jc w:val="left"/>
       </w:pPr>
       <w:r>
         <w:rPr>
-          <w:rFonts w:ascii="Courier New" w:hAnsi="Courier New"/>
+          <w:rFonts w:ascii="Times New Roman" w:hAnsi="Times New Roman"/>
           <w:b w:val="0"/>
           <w:i w:val="0"/>
           <w:color w:val="000000"/>
-          <w:sz w:val="19"/>
+          <w:sz w:val="22"/>
         </w:rPr>
         <w:t>Fig. 8.13   Redis Session Key Database ........................................................................................... 25</w:t>
       </w:r>
@@ -1874,15 +1874,15 @@
     <w:p>
       <w:pPr>
         <w:spacing w:line="360" w:lineRule="auto" w:after="80"/>
-        <w:jc w:val="both"/>
+        <w:jc w:val="left"/>
       </w:pPr>
       <w:r>
         <w:rPr>
-          <w:rFonts w:ascii="Courier New" w:hAnsi="Courier New"/>
+          <w:rFonts w:ascii="Times New Roman" w:hAnsi="Times New Roman"/>
           <w:b w:val="0"/>
           <w:i w:val="0"/>
           <w:color w:val="000000"/>
-          <w:sz w:val="19"/>
+          <w:sz w:val="22"/>
         </w:rPr>
         <w:t>Fig. 8.14   Encrypted Redis Values ........................................................................................... 25</w:t>
       </w:r>
@@ -1890,15 +1890,15 @@
     <w:p>
       <w:pPr>
         <w:spacing w:line="360" w:lineRule="auto" w:after="80"/>
-        <w:jc w:val="both"/>
+        <w:jc w:val="left"/>
       </w:pPr>
       <w:r>
         <w:rPr>
-          <w:rFonts w:ascii="Courier New" w:hAnsi="Courier New"/>
+          <w:rFonts w:ascii="Times New Roman" w:hAnsi="Times New Roman"/>
           <w:b w:val="0"/>
           <w:i w:val="0"/>
           <w:color w:val="000000"/>
-          <w:sz w:val="19"/>
+          <w:sz w:val="22"/>
         </w:rPr>
         <w:t>Fig. 8.15   Pytest 65 Cases Passed ........................................................................................... 25</w:t>
       </w:r>
@@ -1906,15 +1906,15 @@
     <w:p>
       <w:pPr>
         <w:spacing w:line="360" w:lineRule="auto" w:after="80"/>
-        <w:jc w:val="both"/>
+        <w:jc w:val="left"/>
       </w:pPr>
       <w:r>
         <w:rPr>
-          <w:rFonts w:ascii="Courier New" w:hAnsi="Courier New"/>
+          <w:rFonts w:ascii="Times New Roman" w:hAnsi="Times New Roman"/>
           <w:b w:val="0"/>
           <w:i w:val="0"/>
           <w:color w:val="000000"/>
-          <w:sz w:val="19"/>
+          <w:sz w:val="22"/>
         </w:rPr>
         <w:t>Fig. 8.16   Health-check json payload ........................................................................................... 25</w:t>
       </w:r>
@@ -1922,15 +1922,15 @@
     <w:p>
       <w:pPr>
         <w:spacing w:line="360" w:lineRule="auto" w:after="80"/>
-        <w:jc w:val="both"/>
+        <w:jc w:val="left"/>
       </w:pPr>
       <w:r>
         <w:rPr>
-          <w:rFonts w:ascii="Courier New" w:hAnsi="Courier New"/>
+          <w:rFonts w:ascii="Times New Roman" w:hAnsi="Times New Roman"/>
           <w:b w:val="0"/>
           <w:i w:val="0"/>
           <w:color w:val="000000"/>
-          <w:sz w:val="19"/>
+          <w:sz w:val="22"/>
         </w:rPr>
         <w:t>Fig. 8.17   Pattern validator outputs ........................................................................................... 25</w:t>
       </w:r>
@@ -1938,15 +1938,15 @@
     <w:p>
       <w:pPr>
         <w:spacing w:line="360" w:lineRule="auto" w:after="80"/>
-        <w:jc w:val="both"/>
+        <w:jc w:val="left"/>
       </w:pPr>
       <w:r>
         <w:rPr>
-          <w:rFonts w:ascii="Courier New" w:hAnsi="Courier New"/>
+          <w:rFonts w:ascii="Times New Roman" w:hAnsi="Times New Roman"/>
           <w:b w:val="0"/>
           <w:i w:val="0"/>
           <w:color w:val="000000"/>
-          <w:sz w:val="19"/>
+          <w:sz w:val="22"/>
         </w:rPr>
         <w:t>Fig. 8.18   HIPAA coverage reports ........................................................................................... 25</w:t>
       </w:r>
@@ -1954,15 +1954,15 @@
     <w:p>
       <w:pPr>
         <w:spacing w:line="360" w:lineRule="auto" w:after="80"/>
-        <w:jc w:val="both"/>
+        <w:jc w:val="left"/>
       </w:pPr>
       <w:r>
         <w:rPr>
-          <w:rFonts w:ascii="Courier New" w:hAnsi="Courier New"/>
+          <w:rFonts w:ascii="Times New Roman" w:hAnsi="Times New Roman"/>
           <w:b w:val="0"/>
           <w:i w:val="0"/>
           <w:color w:val="000000"/>
-          <w:sz w:val="19"/>
+          <w:sz w:val="22"/>
         </w:rPr>
         <w:t>Fig. 8.19   Accuracy scorer summary ........................................................................................... 25</w:t>
       </w:r>
@@ -1992,15 +1992,15 @@
     <w:p>
       <w:pPr>
         <w:spacing w:line="360" w:lineRule="auto" w:after="80"/>
-        <w:jc w:val="both"/>
+        <w:jc w:val="left"/>
       </w:pPr>
       <w:r>
         <w:rPr>
-          <w:rFonts w:ascii="Courier New" w:hAnsi="Courier New"/>
+          <w:rFonts w:ascii="Times New Roman" w:hAnsi="Times New Roman"/>
           <w:b w:val="0"/>
           <w:i w:val="0"/>
           <w:color w:val="000000"/>
-          <w:sz w:val="19"/>
+          <w:sz w:val="22"/>
         </w:rPr>
         <w:t>Table 1.1   Safe Harbor 18 Protected Identifiers .......................................................................... 2</w:t>
       </w:r>
@@ -2008,15 +2008,15 @@
     <w:p>
       <w:pPr>
         <w:spacing w:line="360" w:lineRule="auto" w:after="80"/>
-        <w:jc w:val="both"/>
+        <w:jc w:val="left"/>
       </w:pPr>
       <w:r>
         <w:rPr>
-          <w:rFonts w:ascii="Courier New" w:hAnsi="Courier New"/>
+          <w:rFonts w:ascii="Times New Roman" w:hAnsi="Times New Roman"/>
           <w:b w:val="0"/>
           <w:i w:val="0"/>
           <w:color w:val="000000"/>
-          <w:sz w:val="19"/>
+          <w:sz w:val="22"/>
         </w:rPr>
         <w:t>Table 2.1   Technology Stack Matrix ........................................................................................... 4</w:t>
       </w:r>
@@ -2024,15 +2024,15 @@
     <w:p>
       <w:pPr>
         <w:spacing w:line="360" w:lineRule="auto" w:after="80"/>
-        <w:jc w:val="both"/>
+        <w:jc w:val="left"/>
       </w:pPr>
       <w:r>
         <w:rPr>
-          <w:rFonts w:ascii="Courier New" w:hAnsi="Courier New"/>
+          <w:rFonts w:ascii="Times New Roman" w:hAnsi="Times New Roman"/>
           <w:b w:val="0"/>
           <w:i w:val="0"/>
           <w:color w:val="000000"/>
-          <w:sz w:val="19"/>
+          <w:sz w:val="22"/>
         </w:rPr>
         <w:t>Table 3.1   Software Requirements Table ........................................................................................... 6</w:t>
       </w:r>
@@ -2040,15 +2040,15 @@
     <w:p>
       <w:pPr>
         <w:spacing w:line="360" w:lineRule="auto" w:after="80"/>
-        <w:jc w:val="both"/>
+        <w:jc w:val="left"/>
       </w:pPr>
       <w:r>
         <w:rPr>
-          <w:rFonts w:ascii="Courier New" w:hAnsi="Courier New"/>
+          <w:rFonts w:ascii="Times New Roman" w:hAnsi="Times New Roman"/>
           <w:b w:val="0"/>
           <w:i w:val="0"/>
           <w:color w:val="000000"/>
-          <w:sz w:val="19"/>
+          <w:sz w:val="22"/>
         </w:rPr>
         <w:t>Table 3.2   Hardware Requirements Table ........................................................................................... 6</w:t>
       </w:r>
@@ -2056,15 +2056,15 @@
     <w:p>
       <w:pPr>
         <w:spacing w:line="360" w:lineRule="auto" w:after="80"/>
-        <w:jc w:val="both"/>
+        <w:jc w:val="left"/>
       </w:pPr>
       <w:r>
         <w:rPr>
-          <w:rFonts w:ascii="Courier New" w:hAnsi="Courier New"/>
+          <w:rFonts w:ascii="Times New Roman" w:hAnsi="Times New Roman"/>
           <w:b w:val="0"/>
           <w:i w:val="0"/>
           <w:color w:val="000000"/>
-          <w:sz w:val="19"/>
+          <w:sz w:val="22"/>
         </w:rPr>
         <w:t>Table 5.1   Flask Gateway Routes ........................................................................................... 12</w:t>
       </w:r>
@@ -2072,15 +2072,15 @@
     <w:p>
       <w:pPr>
         <w:spacing w:line="360" w:lineRule="auto" w:after="80"/>
-        <w:jc w:val="both"/>
+        <w:jc w:val="left"/>
       </w:pPr>
       <w:r>
         <w:rPr>
-          <w:rFonts w:ascii="Courier New" w:hAnsi="Courier New"/>
+          <w:rFonts w:ascii="Times New Roman" w:hAnsi="Times New Roman"/>
           <w:b w:val="0"/>
           <w:i w:val="0"/>
           <w:color w:val="000000"/>
-          <w:sz w:val="19"/>
+          <w:sz w:val="22"/>
         </w:rPr>
         <w:t>Table 5.2   Presidio Entity Configs ........................................................................................... 14</w:t>
       </w:r>
@@ -2088,15 +2088,15 @@
     <w:p>
       <w:pPr>
         <w:spacing w:line="360" w:lineRule="auto" w:after="80"/>
-        <w:jc w:val="both"/>
+        <w:jc w:val="left"/>
       </w:pPr>
       <w:r>
         <w:rPr>
-          <w:rFonts w:ascii="Courier New" w:hAnsi="Courier New"/>
+          <w:rFonts w:ascii="Times New Roman" w:hAnsi="Times New Roman"/>
           <w:b w:val="0"/>
           <w:i w:val="0"/>
           <w:color w:val="000000"/>
-          <w:sz w:val="19"/>
+          <w:sz w:val="22"/>
         </w:rPr>
         <w:t>Table 6.1   Regex priority overlap rankings ........................................................................................... 17</w:t>
       </w:r>
@@ -2104,15 +2104,15 @@
     <w:p>
       <w:pPr>
         <w:spacing w:line="360" w:lineRule="auto" w:after="80"/>
-        <w:jc w:val="both"/>
+        <w:jc w:val="left"/>
       </w:pPr>
       <w:r>
         <w:rPr>
-          <w:rFonts w:ascii="Courier New" w:hAnsi="Courier New"/>
+          <w:rFonts w:ascii="Times New Roman" w:hAnsi="Times New Roman"/>
           <w:b w:val="0"/>
           <w:i w:val="0"/>
           <w:color w:val="000000"/>
-          <w:sz w:val="19"/>
+          <w:sz w:val="22"/>
         </w:rPr>
         <w:t>Table 7.1   Pytest test suite layout ........................................................................................... 21</w:t>
       </w:r>
@@ -2120,15 +2120,15 @@
     <w:p>
       <w:pPr>
         <w:spacing w:line="360" w:lineRule="auto" w:after="80"/>
-        <w:jc w:val="both"/>
+        <w:jc w:val="left"/>
       </w:pPr>
       <w:r>
         <w:rPr>
-          <w:rFonts w:ascii="Courier New" w:hAnsi="Courier New"/>
+          <w:rFonts w:ascii="Times New Roman" w:hAnsi="Times New Roman"/>
           <w:b w:val="0"/>
           <w:i w:val="0"/>
           <w:color w:val="000000"/>
-          <w:sz w:val="19"/>
+          <w:sz w:val="22"/>
         </w:rPr>
         <w:t>Table 7.2   Pattern validator assertion test cases ........................................................................................... 22</w:t>
       </w:r>
@@ -2136,15 +2136,15 @@
     <w:p>
       <w:pPr>
         <w:spacing w:line="360" w:lineRule="auto" w:after="80"/>
-        <w:jc w:val="both"/>
+        <w:jc w:val="left"/>
       </w:pPr>
       <w:r>
         <w:rPr>
-          <w:rFonts w:ascii="Courier New" w:hAnsi="Courier New"/>
+          <w:rFonts w:ascii="Times New Roman" w:hAnsi="Times New Roman"/>
           <w:b w:val="0"/>
           <w:i w:val="0"/>
           <w:color w:val="000000"/>
-          <w:sz w:val="19"/>
+          <w:sz w:val="22"/>
         </w:rPr>
         <w:t>Table 7.3   Test execution results metrics ........................................................................................... 22</w:t>
       </w:r>
@@ -8229,7 +8229,7 @@
     <w:p>
       <w:pPr>
         <w:spacing w:line="360" w:lineRule="auto" w:after="120"/>
-        <w:jc w:val="both"/>
+        <w:jc w:val="left"/>
       </w:pPr>
       <w:r>
         <w:rPr>
@@ -8237,13 +8237,15 @@
           <w:b w:val="0"/>
           <w:i w:val="0"/>
           <w:color w:val="000000"/>
-          <w:sz w:val="22"/>
+          <w:sz w:val="24"/>
         </w:rPr>
         <w:t xml:space="preserve">[1] Microsoft Presidio Documentation, "Microsoft Presidio De-identification API Framework", </w:t>
       </w:r>
       <w:hyperlink r:id="rId35">
         <w:r>
           <w:rPr>
+            <w:rFonts w:ascii="Times New Roman" w:hAnsi="Times New Roman"/>
+            <w:sz w:val="24"/>
             <w:color w:val="0000FF"/>
             <w:u w:val="single"/>
           </w:rPr>
@@ -8260,13 +8262,15 @@
           <w:b w:val="0"/>
           <w:i w:val="0"/>
           <w:color w:val="000000"/>
-          <w:sz w:val="22"/>
+          <w:sz w:val="24"/>
         </w:rPr>
         <w:t xml:space="preserve">[2] U.S. Department of Health and Human Services (HHS), "HIPAA Safe Harbor De-identification Standards and Guidelines", </w:t>
       </w:r>
       <w:hyperlink r:id="rId36">
         <w:r>
           <w:rPr>
+            <w:rFonts w:ascii="Times New Roman" w:hAnsi="Times New Roman"/>
+            <w:sz w:val="24"/>
             <w:color w:val="0000FF"/>
             <w:u w:val="single"/>
           </w:rPr>
@@ -8283,13 +8287,15 @@
           <w:b w:val="0"/>
           <w:i w:val="0"/>
           <w:color w:val="000000"/>
-          <w:sz w:val="22"/>
+          <w:sz w:val="24"/>
         </w:rPr>
         <w:t xml:space="preserve">[3] Flask Development Group, "Flask Web Application Micro-Framework for Python", </w:t>
       </w:r>
       <w:hyperlink r:id="rId37">
         <w:r>
           <w:rPr>
+            <w:rFonts w:ascii="Times New Roman" w:hAnsi="Times New Roman"/>
+            <w:sz w:val="24"/>
             <w:color w:val="0000FF"/>
             <w:u w:val="single"/>
           </w:rPr>
@@ -8306,13 +8312,15 @@
           <w:b w:val="0"/>
           <w:i w:val="0"/>
           <w:color w:val="000000"/>
-          <w:sz w:val="22"/>
+          <w:sz w:val="24"/>
         </w:rPr>
         <w:t xml:space="preserve">[4] Redis Documentation, "Redis High-Performance In-Memory Key-Value Caching Store", </w:t>
       </w:r>
       <w:hyperlink r:id="rId38">
         <w:r>
           <w:rPr>
+            <w:rFonts w:ascii="Times New Roman" w:hAnsi="Times New Roman"/>
+            <w:sz w:val="24"/>
             <w:color w:val="0000FF"/>
             <w:u w:val="single"/>
           </w:rPr>
@@ -8329,13 +8337,15 @@
           <w:b w:val="0"/>
           <w:i w:val="0"/>
           <w:color w:val="000000"/>
-          <w:sz w:val="22"/>
+          <w:sz w:val="24"/>
         </w:rPr>
         <w:t xml:space="preserve">[5] Cryptography Library Team, "Fernet Symmetric Key Cryptography Encryption Specifications", </w:t>
       </w:r>
       <w:hyperlink r:id="rId39">
         <w:r>
           <w:rPr>
+            <w:rFonts w:ascii="Times New Roman" w:hAnsi="Times New Roman"/>
+            <w:sz w:val="24"/>
             <w:color w:val="0000FF"/>
             <w:u w:val="single"/>
           </w:rPr>
@@ -8352,13 +8362,15 @@
           <w:b w:val="0"/>
           <w:i w:val="0"/>
           <w:color w:val="000000"/>
-          <w:sz w:val="22"/>
+          <w:sz w:val="24"/>
         </w:rPr>
         <w:t xml:space="preserve">[6] spaCy Documentation, "spaCy Named Entity Recognition and Language Parser Models", </w:t>
       </w:r>
       <w:hyperlink r:id="rId40">
         <w:r>
           <w:rPr>
+            <w:rFonts w:ascii="Times New Roman" w:hAnsi="Times New Roman"/>
+            <w:sz w:val="24"/>
             <w:color w:val="0000FF"/>
             <w:u w:val="single"/>
           </w:rPr>
@@ -8375,13 +8387,15 @@
           <w:b w:val="0"/>
           <w:i w:val="0"/>
           <w:color w:val="000000"/>
-          <w:sz w:val="22"/>
+          <w:sz w:val="24"/>
         </w:rPr>
         <w:t xml:space="preserve">[7] OWASP Foundation, "OWASP API Security Top 10 Vulnerabilities and Mitigation Standards", </w:t>
       </w:r>
       <w:hyperlink r:id="rId41">
         <w:r>
           <w:rPr>
+            <w:rFonts w:ascii="Times New Roman" w:hAnsi="Times New Roman"/>
+            <w:sz w:val="24"/>
             <w:color w:val="0000FF"/>
             <w:u w:val="single"/>
           </w:rPr>

</xml_diff>